<commit_message>
fix(pos-app): honest pharmacy/restaurant mode-card subtitles
The open-shift mode-card blurbs overpromised vs. what the registers actually do:
- Pharmacy "Dispensing with batch/expiry & Rx" -> "Dispensing with patient & Rx
  capture" (the register captures patient/prescriber/Rx, not batch/expiry).
- Restaurant "Table service, courses, split bill" -> "Table service with order
  tickets" (tables + menu + order ticket; no course grouping; split is via
  multi-tender at payment, not a bill-split UI).

Updated the user manual to match (the mode table in 01-shift and the prose in
00-getting-started) and rebuilt docs/POS-USER-MANUAL.md + .docx. flutter analyze
unchanged (3 pre-existing guarded build-context infos).

Co-Authored-By: Claude Opus 4.8 (1M context) <noreply@anthropic.com>
</commit_message>
<xml_diff>
--- a/docs/POS-USER-MANUAL.docx
+++ b/docs/POS-USER-MANUAL.docx
@@ -1490,7 +1490,7 @@
         <w:t>Why they exist.</w:t>
       </w:r>
       <w:r>
-        <w:t xml:space="preserve"> A grocery cashier wants to scan barcodes fast; a pharmacy needs patient and prescription details; a restaurant works in tables and courses. One till would feel wrong for all three, so OrbixPOS gives each its own purpose-built register while keeping everything else the same — so the skills you learn in one mode carry straight over.</w:t>
+        <w:t xml:space="preserve"> A grocery cashier wants to scan barcodes fast; a pharmacy needs patient and prescription details; a restaurant works in tables and order tickets. One till would feel wrong for all three, so OrbixPOS gives each its own purpose-built register while keeping everything else the same — so the skills you learn in one mode carry straight over.</w:t>
       </w:r>
     </w:p>
     <w:p>
@@ -2552,7 +2552,7 @@
           </w:tcPr>
           <w:p>
             <w:r>
-              <w:t>Dispensing with batch/expiry &amp; Rx</w:t>
+              <w:t>Dispensing with patient &amp; Rx capture</w:t>
             </w:r>
           </w:p>
         </w:tc>
@@ -2587,7 +2587,7 @@
           </w:tcPr>
           <w:p>
             <w:r>
-              <w:t>Table service, courses, split bill</w:t>
+              <w:t>Table service with order tickets</w:t>
             </w:r>
           </w:p>
         </w:tc>

</xml_diff>

<commit_message>
docs(manuals): static clickable TOC in the .docx (works in the with-images build)
The .docx previously used a Word TOC *field* that shows a placeholder until the
reader accepts Word's 'update fields?' prompt — so the image-rich manual (the
one mostly used) looked like it had no contents. Replace it with a STATIC,
clickable Table of Contents rendered at build time: chapters (H1) + sections
(H2) as hyperlinks to per-heading bookmarks, always visible and navigable the
moment the document opens, no field update needed.

md2docx.py: collect_toc() + per-heading bookmarks + add_toc_entry() hyperlinks,
kept in lock-step at TOC_DEPTH=2. Applies to every generated .docx — main
(109 entries), the local with-images build (109), and POS (77); every TOC link
verified to resolve to a real bookmark. Regenerated the tracked USER-MANUAL.docx
+ POS-USER-MANUAL.docx (the .md TOCs from #213 are unchanged).

Co-Authored-By: Claude Opus 4.8 <noreply@anthropic.com>
</commit_message>
<xml_diff>
--- a/docs/POS-USER-MANUAL.docx
+++ b/docs/POS-USER-MANUAL.docx
@@ -46,12 +46,1167 @@
       </w:r>
     </w:p>
     <w:p>
-      <w:r/>
-      <w:fldSimple w:instr="TOC \o &quot;1-3&quot; \h \z \u">
+      <w:pPr>
+        <w:spacing w:after="40"/>
+        <w:ind w:left="0"/>
+      </w:pPr>
+      <w:hyperlink w:anchor="_Toc0000">
         <w:r>
-          <w:t>Updating… (if this line persists, right-click → Update Field).</w:t>
+          <w:rPr>
+            <w:b/>
+            <w:color w:val="1155CC"/>
+            <w:u w:val="single"/>
+          </w:rPr>
+          <w:t xml:space="preserve">Getting Started</w:t>
         </w:r>
-      </w:fldSimple>
+      </w:hyperlink>
+    </w:p>
+    <w:p>
+      <w:pPr>
+        <w:spacing w:after="40"/>
+        <w:ind w:left="403"/>
+      </w:pPr>
+      <w:hyperlink w:anchor="_Toc0001">
+        <w:r>
+          <w:rPr>
+            <w:color w:val="1155CC"/>
+            <w:u w:val="single"/>
+          </w:rPr>
+          <w:t xml:space="preserve">What OrbixPOS Is</w:t>
+        </w:r>
+      </w:hyperlink>
+    </w:p>
+    <w:p>
+      <w:pPr>
+        <w:spacing w:after="40"/>
+        <w:ind w:left="403"/>
+      </w:pPr>
+      <w:hyperlink w:anchor="_Toc0002">
+        <w:r>
+          <w:rPr>
+            <w:color w:val="1155CC"/>
+            <w:u w:val="single"/>
+          </w:rPr>
+          <w:t xml:space="preserve">First-Run Setup — Pointing the Till at Your Server</w:t>
+        </w:r>
+      </w:hyperlink>
+    </w:p>
+    <w:p>
+      <w:pPr>
+        <w:spacing w:after="40"/>
+        <w:ind w:left="403"/>
+      </w:pPr>
+      <w:hyperlink w:anchor="_Toc0003">
+        <w:r>
+          <w:rPr>
+            <w:color w:val="1155CC"/>
+            <w:u w:val="single"/>
+          </w:rPr>
+          <w:t xml:space="preserve">Signing In</w:t>
+        </w:r>
+      </w:hyperlink>
+    </w:p>
+    <w:p>
+      <w:pPr>
+        <w:spacing w:after="40"/>
+        <w:ind w:left="403"/>
+      </w:pPr>
+      <w:hyperlink w:anchor="_Toc0004">
+        <w:r>
+          <w:rPr>
+            <w:color w:val="1155CC"/>
+            <w:u w:val="single"/>
+          </w:rPr>
+          <w:t xml:space="preserve">The Screen Layout</w:t>
+        </w:r>
+      </w:hyperlink>
+    </w:p>
+    <w:p>
+      <w:pPr>
+        <w:spacing w:after="40"/>
+        <w:ind w:left="403"/>
+      </w:pPr>
+      <w:hyperlink w:anchor="_Toc0005">
+        <w:r>
+          <w:rPr>
+            <w:color w:val="1155CC"/>
+            <w:u w:val="single"/>
+          </w:rPr>
+          <w:t xml:space="preserve">The Three Business Modes</w:t>
+        </w:r>
+      </w:hyperlink>
+    </w:p>
+    <w:p>
+      <w:pPr>
+        <w:spacing w:after="40"/>
+        <w:ind w:left="403"/>
+      </w:pPr>
+      <w:hyperlink w:anchor="_Toc0006">
+        <w:r>
+          <w:rPr>
+            <w:color w:val="1155CC"/>
+            <w:u w:val="single"/>
+          </w:rPr>
+          <w:t xml:space="preserve">Signing Out</w:t>
+        </w:r>
+      </w:hyperlink>
+    </w:p>
+    <w:p>
+      <w:pPr>
+        <w:spacing w:after="40"/>
+        <w:ind w:left="403"/>
+      </w:pPr>
+      <w:hyperlink w:anchor="_Toc0007">
+        <w:r>
+          <w:rPr>
+            <w:color w:val="1155CC"/>
+            <w:u w:val="single"/>
+          </w:rPr>
+          <w:t xml:space="preserve">Where to Go Next</w:t>
+        </w:r>
+      </w:hyperlink>
+    </w:p>
+    <w:p>
+      <w:pPr>
+        <w:spacing w:after="40"/>
+        <w:ind w:left="0"/>
+      </w:pPr>
+      <w:hyperlink w:anchor="_Toc0008">
+        <w:r>
+          <w:rPr>
+            <w:b/>
+            <w:color w:val="1155CC"/>
+            <w:u w:val="single"/>
+          </w:rPr>
+          <w:t xml:space="preserve">Starting and Ending a Shift</w:t>
+        </w:r>
+      </w:hyperlink>
+    </w:p>
+    <w:p>
+      <w:pPr>
+        <w:spacing w:after="40"/>
+        <w:ind w:left="403"/>
+      </w:pPr>
+      <w:hyperlink w:anchor="_Toc0009">
+        <w:r>
+          <w:rPr>
+            <w:color w:val="1155CC"/>
+            <w:u w:val="single"/>
+          </w:rPr>
+          <w:t xml:space="preserve">What a till and a cash session are</w:t>
+        </w:r>
+      </w:hyperlink>
+    </w:p>
+    <w:p>
+      <w:pPr>
+        <w:spacing w:after="40"/>
+        <w:ind w:left="403"/>
+      </w:pPr>
+      <w:hyperlink w:anchor="_Toc0010">
+        <w:r>
+          <w:rPr>
+            <w:color w:val="1155CC"/>
+            <w:u w:val="single"/>
+          </w:rPr>
+          <w:t xml:space="preserve">Opening your shift</w:t>
+        </w:r>
+      </w:hyperlink>
+    </w:p>
+    <w:p>
+      <w:pPr>
+        <w:spacing w:after="40"/>
+        <w:ind w:left="403"/>
+      </w:pPr>
+      <w:hyperlink w:anchor="_Toc0011">
+        <w:r>
+          <w:rPr>
+            <w:color w:val="1155CC"/>
+            <w:u w:val="single"/>
+          </w:rPr>
+          <w:t xml:space="preserve">The session number and status chips</w:t>
+        </w:r>
+      </w:hyperlink>
+    </w:p>
+    <w:p>
+      <w:pPr>
+        <w:spacing w:after="40"/>
+        <w:ind w:left="403"/>
+      </w:pPr>
+      <w:hyperlink w:anchor="_Toc0012">
+        <w:r>
+          <w:rPr>
+            <w:color w:val="1155CC"/>
+            <w:u w:val="single"/>
+          </w:rPr>
+          <w:t xml:space="preserve">The session menu</w:t>
+        </w:r>
+      </w:hyperlink>
+    </w:p>
+    <w:p>
+      <w:pPr>
+        <w:spacing w:after="40"/>
+        <w:ind w:left="403"/>
+      </w:pPr>
+      <w:hyperlink w:anchor="_Toc0013">
+        <w:r>
+          <w:rPr>
+            <w:color w:val="1155CC"/>
+            <w:u w:val="single"/>
+          </w:rPr>
+          <w:t xml:space="preserve">X-read — a mid-shift drawer report</w:t>
+        </w:r>
+      </w:hyperlink>
+    </w:p>
+    <w:p>
+      <w:pPr>
+        <w:spacing w:after="40"/>
+        <w:ind w:left="403"/>
+      </w:pPr>
+      <w:hyperlink w:anchor="_Toc0014">
+        <w:r>
+          <w:rPr>
+            <w:color w:val="1155CC"/>
+            <w:u w:val="single"/>
+          </w:rPr>
+          <w:t xml:space="preserve">Recording a cash payout</w:t>
+        </w:r>
+      </w:hyperlink>
+    </w:p>
+    <w:p>
+      <w:pPr>
+        <w:spacing w:after="40"/>
+        <w:ind w:left="403"/>
+      </w:pPr>
+      <w:hyperlink w:anchor="_Toc0015">
+        <w:r>
+          <w:rPr>
+            <w:color w:val="1155CC"/>
+            <w:u w:val="single"/>
+          </w:rPr>
+          <w:t xml:space="preserve">Closing the session</w:t>
+        </w:r>
+      </w:hyperlink>
+    </w:p>
+    <w:p>
+      <w:pPr>
+        <w:spacing w:after="40"/>
+        <w:ind w:left="403"/>
+      </w:pPr>
+      <w:hyperlink w:anchor="_Toc0016">
+        <w:r>
+          <w:rPr>
+            <w:color w:val="1155CC"/>
+            <w:u w:val="single"/>
+          </w:rPr>
+          <w:t xml:space="preserve">Reconcile / Z-read (supervisor only)</w:t>
+        </w:r>
+      </w:hyperlink>
+    </w:p>
+    <w:p>
+      <w:pPr>
+        <w:spacing w:after="40"/>
+        <w:ind w:left="403"/>
+      </w:pPr>
+      <w:hyperlink w:anchor="_Toc0017">
+        <w:r>
+          <w:rPr>
+            <w:color w:val="1155CC"/>
+            <w:u w:val="single"/>
+          </w:rPr>
+          <w:t xml:space="preserve">End-of-shift checklist</w:t>
+        </w:r>
+      </w:hyperlink>
+    </w:p>
+    <w:p>
+      <w:pPr>
+        <w:spacing w:after="40"/>
+        <w:ind w:left="0"/>
+      </w:pPr>
+      <w:hyperlink w:anchor="_Toc0018">
+        <w:r>
+          <w:rPr>
+            <w:b/>
+            <w:color w:val="1155CC"/>
+            <w:u w:val="single"/>
+          </w:rPr>
+          <w:t xml:space="preserve">Selling — Supermarket</w:t>
+        </w:r>
+      </w:hyperlink>
+    </w:p>
+    <w:p>
+      <w:pPr>
+        <w:spacing w:after="40"/>
+        <w:ind w:left="403"/>
+      </w:pPr>
+      <w:hyperlink w:anchor="_Toc0019">
+        <w:r>
+          <w:rPr>
+            <w:color w:val="1155CC"/>
+            <w:u w:val="single"/>
+          </w:rPr>
+          <w:t xml:space="preserve">1. The supermarket screen at a glance</w:t>
+        </w:r>
+      </w:hyperlink>
+    </w:p>
+    <w:p>
+      <w:pPr>
+        <w:spacing w:after="40"/>
+        <w:ind w:left="403"/>
+      </w:pPr>
+      <w:hyperlink w:anchor="_Toc0020">
+        <w:r>
+          <w:rPr>
+            <w:color w:val="1155CC"/>
+            <w:u w:val="single"/>
+          </w:rPr>
+          <w:t xml:space="preserve">2. Adding items</w:t>
+        </w:r>
+      </w:hyperlink>
+    </w:p>
+    <w:p>
+      <w:pPr>
+        <w:spacing w:after="40"/>
+        <w:ind w:left="403"/>
+      </w:pPr>
+      <w:hyperlink w:anchor="_Toc0021">
+        <w:r>
+          <w:rPr>
+            <w:color w:val="1155CC"/>
+            <w:u w:val="single"/>
+          </w:rPr>
+          <w:t xml:space="preserve">3. Working with lines in the grid</w:t>
+        </w:r>
+      </w:hyperlink>
+    </w:p>
+    <w:p>
+      <w:pPr>
+        <w:spacing w:after="40"/>
+        <w:ind w:left="403"/>
+      </w:pPr>
+      <w:hyperlink w:anchor="_Toc0022">
+        <w:r>
+          <w:rPr>
+            <w:color w:val="1155CC"/>
+            <w:u w:val="single"/>
+          </w:rPr>
+          <w:t xml:space="preserve">4. Age-restricted items</w:t>
+        </w:r>
+      </w:hyperlink>
+    </w:p>
+    <w:p>
+      <w:pPr>
+        <w:spacing w:after="40"/>
+        <w:ind w:left="403"/>
+      </w:pPr>
+      <w:hyperlink w:anchor="_Toc0023">
+        <w:r>
+          <w:rPr>
+            <w:color w:val="1155CC"/>
+            <w:u w:val="single"/>
+          </w:rPr>
+          <w:t xml:space="preserve">5. Choosing the customer</w:t>
+        </w:r>
+      </w:hyperlink>
+    </w:p>
+    <w:p>
+      <w:pPr>
+        <w:spacing w:after="40"/>
+        <w:ind w:left="403"/>
+      </w:pPr>
+      <w:hyperlink w:anchor="_Toc0024">
+        <w:r>
+          <w:rPr>
+            <w:color w:val="1155CC"/>
+            <w:u w:val="single"/>
+          </w:rPr>
+          <w:t xml:space="preserve">6. Reading the running total</w:t>
+        </w:r>
+      </w:hyperlink>
+    </w:p>
+    <w:p>
+      <w:pPr>
+        <w:spacing w:after="40"/>
+        <w:ind w:left="403"/>
+      </w:pPr>
+      <w:hyperlink w:anchor="_Toc0025">
+        <w:r>
+          <w:rPr>
+            <w:color w:val="1155CC"/>
+            <w:u w:val="single"/>
+          </w:rPr>
+          <w:t xml:space="preserve">7. Finishing the sale — Pay</w:t>
+        </w:r>
+      </w:hyperlink>
+    </w:p>
+    <w:p>
+      <w:pPr>
+        <w:spacing w:after="40"/>
+        <w:ind w:left="403"/>
+      </w:pPr>
+      <w:hyperlink w:anchor="_Toc0026">
+        <w:r>
+          <w:rPr>
+            <w:color w:val="1155CC"/>
+            <w:u w:val="single"/>
+          </w:rPr>
+          <w:t xml:space="preserve">8. Quick troubleshooting</w:t>
+        </w:r>
+      </w:hyperlink>
+    </w:p>
+    <w:p>
+      <w:pPr>
+        <w:spacing w:after="40"/>
+        <w:ind w:left="0"/>
+      </w:pPr>
+      <w:hyperlink w:anchor="_Toc0027">
+        <w:r>
+          <w:rPr>
+            <w:b/>
+            <w:color w:val="1155CC"/>
+            <w:u w:val="single"/>
+          </w:rPr>
+          <w:t xml:space="preserve">Selling — Pharmacy and Restaurant</w:t>
+        </w:r>
+      </w:hyperlink>
+    </w:p>
+    <w:p>
+      <w:pPr>
+        <w:spacing w:after="40"/>
+        <w:ind w:left="403"/>
+      </w:pPr>
+      <w:hyperlink w:anchor="_Toc0028">
+        <w:r>
+          <w:rPr>
+            <w:color w:val="1155CC"/>
+            <w:u w:val="single"/>
+          </w:rPr>
+          <w:t xml:space="preserve">1. Switching modes</w:t>
+        </w:r>
+      </w:hyperlink>
+    </w:p>
+    <w:p>
+      <w:pPr>
+        <w:spacing w:after="40"/>
+        <w:ind w:left="403"/>
+      </w:pPr>
+      <w:hyperlink w:anchor="_Toc0029">
+        <w:r>
+          <w:rPr>
+            <w:color w:val="1155CC"/>
+            <w:u w:val="single"/>
+          </w:rPr>
+          <w:t xml:space="preserve">2. The Pharmacy register</w:t>
+        </w:r>
+      </w:hyperlink>
+    </w:p>
+    <w:p>
+      <w:pPr>
+        <w:spacing w:after="40"/>
+        <w:ind w:left="403"/>
+      </w:pPr>
+      <w:hyperlink w:anchor="_Toc0030">
+        <w:r>
+          <w:rPr>
+            <w:color w:val="1155CC"/>
+            <w:u w:val="single"/>
+          </w:rPr>
+          <w:t xml:space="preserve">3. The Restaurant register</w:t>
+        </w:r>
+      </w:hyperlink>
+    </w:p>
+    <w:p>
+      <w:pPr>
+        <w:spacing w:after="40"/>
+        <w:ind w:left="403"/>
+      </w:pPr>
+      <w:hyperlink w:anchor="_Toc0031">
+        <w:r>
+          <w:rPr>
+            <w:color w:val="1155CC"/>
+            <w:u w:val="single"/>
+          </w:rPr>
+          <w:t xml:space="preserve">4. Quick reference</w:t>
+        </w:r>
+      </w:hyperlink>
+    </w:p>
+    <w:p>
+      <w:pPr>
+        <w:spacing w:after="40"/>
+        <w:ind w:left="0"/>
+      </w:pPr>
+      <w:hyperlink w:anchor="_Toc0032">
+        <w:r>
+          <w:rPr>
+            <w:b/>
+            <w:color w:val="1155CC"/>
+            <w:u w:val="single"/>
+          </w:rPr>
+          <w:t xml:space="preserve">Taking Payment</w:t>
+        </w:r>
+      </w:hyperlink>
+    </w:p>
+    <w:p>
+      <w:pPr>
+        <w:spacing w:after="40"/>
+        <w:ind w:left="403"/>
+      </w:pPr>
+      <w:hyperlink w:anchor="_Toc0033">
+        <w:r>
+          <w:rPr>
+            <w:color w:val="1155CC"/>
+            <w:u w:val="single"/>
+          </w:rPr>
+          <w:t xml:space="preserve">Opening the Payment screen</w:t>
+        </w:r>
+      </w:hyperlink>
+    </w:p>
+    <w:p>
+      <w:pPr>
+        <w:spacing w:after="40"/>
+        <w:ind w:left="403"/>
+      </w:pPr>
+      <w:hyperlink w:anchor="_Toc0034">
+        <w:r>
+          <w:rPr>
+            <w:color w:val="1155CC"/>
+            <w:u w:val="single"/>
+          </w:rPr>
+          <w:t xml:space="preserve">What you see on the Payment screen</w:t>
+        </w:r>
+      </w:hyperlink>
+    </w:p>
+    <w:p>
+      <w:pPr>
+        <w:spacing w:after="40"/>
+        <w:ind w:left="403"/>
+      </w:pPr>
+      <w:hyperlink w:anchor="_Toc0035">
+        <w:r>
+          <w:rPr>
+            <w:color w:val="1155CC"/>
+            <w:u w:val="single"/>
+          </w:rPr>
+          <w:t xml:space="preserve">The four tender types</w:t>
+        </w:r>
+      </w:hyperlink>
+    </w:p>
+    <w:p>
+      <w:pPr>
+        <w:spacing w:after="40"/>
+        <w:ind w:left="403"/>
+      </w:pPr>
+      <w:hyperlink w:anchor="_Toc0036">
+        <w:r>
+          <w:rPr>
+            <w:color w:val="1155CC"/>
+            <w:u w:val="single"/>
+          </w:rPr>
+          <w:t xml:space="preserve">Task: a simple cash sale</w:t>
+        </w:r>
+      </w:hyperlink>
+    </w:p>
+    <w:p>
+      <w:pPr>
+        <w:spacing w:after="40"/>
+        <w:ind w:left="403"/>
+      </w:pPr>
+      <w:hyperlink w:anchor="_Toc0037">
+        <w:r>
+          <w:rPr>
+            <w:color w:val="1155CC"/>
+            <w:u w:val="single"/>
+          </w:rPr>
+          <w:t xml:space="preserve">Task: split or multi-tender payment</w:t>
+        </w:r>
+      </w:hyperlink>
+    </w:p>
+    <w:p>
+      <w:pPr>
+        <w:spacing w:after="40"/>
+        <w:ind w:left="403"/>
+      </w:pPr>
+      <w:hyperlink w:anchor="_Toc0038">
+        <w:r>
+          <w:rPr>
+            <w:color w:val="1155CC"/>
+            <w:u w:val="single"/>
+          </w:rPr>
+          <w:t xml:space="preserve">The change preview</w:t>
+        </w:r>
+      </w:hyperlink>
+    </w:p>
+    <w:p>
+      <w:pPr>
+        <w:spacing w:after="40"/>
+        <w:ind w:left="403"/>
+      </w:pPr>
+      <w:hyperlink w:anchor="_Toc0039">
+        <w:r>
+          <w:rPr>
+            <w:color w:val="1155CC"/>
+            <w:u w:val="single"/>
+          </w:rPr>
+          <w:t xml:space="preserve">Completing the sale</w:t>
+        </w:r>
+      </w:hyperlink>
+    </w:p>
+    <w:p>
+      <w:pPr>
+        <w:spacing w:after="40"/>
+        <w:ind w:left="403"/>
+      </w:pPr>
+      <w:hyperlink w:anchor="_Toc0040">
+        <w:r>
+          <w:rPr>
+            <w:color w:val="1155CC"/>
+            <w:u w:val="single"/>
+          </w:rPr>
+          <w:t xml:space="preserve">"Did that go through?" — the safe-retry guarantee</w:t>
+        </w:r>
+      </w:hyperlink>
+    </w:p>
+    <w:p>
+      <w:pPr>
+        <w:spacing w:after="40"/>
+        <w:ind w:left="403"/>
+      </w:pPr>
+      <w:hyperlink w:anchor="_Toc0041">
+        <w:r>
+          <w:rPr>
+            <w:color w:val="1155CC"/>
+            <w:u w:val="single"/>
+          </w:rPr>
+          <w:t xml:space="preserve">After payment: the receipt</w:t>
+        </w:r>
+      </w:hyperlink>
+    </w:p>
+    <w:p>
+      <w:pPr>
+        <w:spacing w:after="40"/>
+        <w:ind w:left="403"/>
+      </w:pPr>
+      <w:hyperlink w:anchor="_Toc0042">
+        <w:r>
+          <w:rPr>
+            <w:color w:val="1155CC"/>
+            <w:u w:val="single"/>
+          </w:rPr>
+          <w:t xml:space="preserve">Quick reference</w:t>
+        </w:r>
+      </w:hyperlink>
+    </w:p>
+    <w:p>
+      <w:pPr>
+        <w:spacing w:after="40"/>
+        <w:ind w:left="0"/>
+      </w:pPr>
+      <w:hyperlink w:anchor="_Toc0043">
+        <w:r>
+          <w:rPr>
+            <w:b/>
+            <w:color w:val="1155CC"/>
+            <w:u w:val="single"/>
+          </w:rPr>
+          <w:t xml:space="preserve">Receipts and Refunds</w:t>
+        </w:r>
+      </w:hyperlink>
+    </w:p>
+    <w:p>
+      <w:pPr>
+        <w:spacing w:after="40"/>
+        <w:ind w:left="403"/>
+      </w:pPr>
+      <w:hyperlink w:anchor="_Toc0044">
+        <w:r>
+          <w:rPr>
+            <w:color w:val="1155CC"/>
+            <w:u w:val="single"/>
+          </w:rPr>
+          <w:t xml:space="preserve">1. The receipt screen</w:t>
+        </w:r>
+      </w:hyperlink>
+    </w:p>
+    <w:p>
+      <w:pPr>
+        <w:spacing w:after="40"/>
+        <w:ind w:left="403"/>
+      </w:pPr>
+      <w:hyperlink w:anchor="_Toc0045">
+        <w:r>
+          <w:rPr>
+            <w:color w:val="1155CC"/>
+            <w:u w:val="single"/>
+          </w:rPr>
+          <w:t xml:space="preserve">2. Printing a receipt</w:t>
+        </w:r>
+      </w:hyperlink>
+    </w:p>
+    <w:p>
+      <w:pPr>
+        <w:spacing w:after="40"/>
+        <w:ind w:left="403"/>
+      </w:pPr>
+      <w:hyperlink w:anchor="_Toc0046">
+        <w:r>
+          <w:rPr>
+            <w:color w:val="1155CC"/>
+            <w:u w:val="single"/>
+          </w:rPr>
+          <w:t xml:space="preserve">3. Gift receipts (hiding prices)</w:t>
+        </w:r>
+      </w:hyperlink>
+    </w:p>
+    <w:p>
+      <w:pPr>
+        <w:spacing w:after="40"/>
+        <w:ind w:left="403"/>
+      </w:pPr>
+      <w:hyperlink w:anchor="_Toc0047">
+        <w:r>
+          <w:rPr>
+            <w:color w:val="1155CC"/>
+            <w:u w:val="single"/>
+          </w:rPr>
+          <w:t xml:space="preserve">4. Reprinting an earlier receipt</w:t>
+        </w:r>
+      </w:hyperlink>
+    </w:p>
+    <w:p>
+      <w:pPr>
+        <w:spacing w:after="40"/>
+        <w:ind w:left="403"/>
+      </w:pPr>
+      <w:hyperlink w:anchor="_Toc0048">
+        <w:r>
+          <w:rPr>
+            <w:color w:val="1155CC"/>
+            <w:u w:val="single"/>
+          </w:rPr>
+          <w:t xml:space="preserve">5. Refunding (reversing) a whole sale</w:t>
+        </w:r>
+      </w:hyperlink>
+    </w:p>
+    <w:p>
+      <w:pPr>
+        <w:spacing w:after="40"/>
+        <w:ind w:left="403"/>
+      </w:pPr>
+      <w:hyperlink w:anchor="_Toc0049">
+        <w:r>
+          <w:rPr>
+            <w:color w:val="1155CC"/>
+            <w:u w:val="single"/>
+          </w:rPr>
+          <w:t xml:space="preserve">6. What OrbixPOS does *not* do — partial and single-line refunds</w:t>
+        </w:r>
+      </w:hyperlink>
+    </w:p>
+    <w:p>
+      <w:pPr>
+        <w:spacing w:after="40"/>
+        <w:ind w:left="403"/>
+      </w:pPr>
+      <w:hyperlink w:anchor="_Toc0050">
+        <w:r>
+          <w:rPr>
+            <w:color w:val="1155CC"/>
+            <w:u w:val="single"/>
+          </w:rPr>
+          <w:t xml:space="preserve">7. The cash-drawer refund payout (the alternative)</w:t>
+        </w:r>
+      </w:hyperlink>
+    </w:p>
+    <w:p>
+      <w:pPr>
+        <w:spacing w:after="40"/>
+        <w:ind w:left="403"/>
+      </w:pPr>
+      <w:hyperlink w:anchor="_Toc0051">
+        <w:r>
+          <w:rPr>
+            <w:color w:val="1155CC"/>
+            <w:u w:val="single"/>
+          </w:rPr>
+          <w:t xml:space="preserve">8. Quick reference and troubleshooting</w:t>
+        </w:r>
+      </w:hyperlink>
+    </w:p>
+    <w:p>
+      <w:pPr>
+        <w:spacing w:after="40"/>
+        <w:ind w:left="0"/>
+      </w:pPr>
+      <w:hyperlink w:anchor="_Toc0052">
+        <w:r>
+          <w:rPr>
+            <w:b/>
+            <w:color w:val="1155CC"/>
+            <w:u w:val="single"/>
+          </w:rPr>
+          <w:t xml:space="preserve">Troubleshooting and Good Practice</w:t>
+        </w:r>
+      </w:hyperlink>
+    </w:p>
+    <w:p>
+      <w:pPr>
+        <w:spacing w:after="40"/>
+        <w:ind w:left="403"/>
+      </w:pPr>
+      <w:hyperlink w:anchor="_Toc0053">
+        <w:r>
+          <w:rPr>
+            <w:color w:val="1155CC"/>
+            <w:u w:val="single"/>
+          </w:rPr>
+          <w:t xml:space="preserve">How OrbixPOS tells you something went wrong</w:t>
+        </w:r>
+      </w:hyperlink>
+    </w:p>
+    <w:p>
+      <w:pPr>
+        <w:spacing w:after="40"/>
+        <w:ind w:left="403"/>
+      </w:pPr>
+      <w:hyperlink w:anchor="_Toc0054">
+        <w:r>
+          <w:rPr>
+            <w:color w:val="1155CC"/>
+            <w:u w:val="single"/>
+          </w:rPr>
+          <w:t xml:space="preserve">Cannot reach the server</w:t>
+        </w:r>
+      </w:hyperlink>
+    </w:p>
+    <w:p>
+      <w:pPr>
+        <w:spacing w:after="40"/>
+        <w:ind w:left="403"/>
+      </w:pPr>
+      <w:hyperlink w:anchor="_Toc0055">
+        <w:r>
+          <w:rPr>
+            <w:color w:val="1155CC"/>
+            <w:u w:val="single"/>
+          </w:rPr>
+          <w:t xml:space="preserve">Your session has expired / you were signed out</w:t>
+        </w:r>
+      </w:hyperlink>
+    </w:p>
+    <w:p>
+      <w:pPr>
+        <w:spacing w:after="40"/>
+        <w:ind w:left="403"/>
+      </w:pPr>
+      <w:hyperlink w:anchor="_Toc0056">
+        <w:r>
+          <w:rPr>
+            <w:color w:val="1155CC"/>
+            <w:u w:val="single"/>
+          </w:rPr>
+          <w:t xml:space="preserve">You do not have permission</w:t>
+        </w:r>
+      </w:hyperlink>
+    </w:p>
+    <w:p>
+      <w:pPr>
+        <w:spacing w:after="40"/>
+        <w:ind w:left="403"/>
+      </w:pPr>
+      <w:hyperlink w:anchor="_Toc0057">
+        <w:r>
+          <w:rPr>
+            <w:color w:val="1155CC"/>
+            <w:u w:val="single"/>
+          </w:rPr>
+          <w:t xml:space="preserve">Age not verified stops a sale</w:t>
+        </w:r>
+      </w:hyperlink>
+    </w:p>
+    <w:p>
+      <w:pPr>
+        <w:spacing w:after="40"/>
+        <w:ind w:left="403"/>
+      </w:pPr>
+      <w:hyperlink w:anchor="_Toc0058">
+        <w:r>
+          <w:rPr>
+            <w:color w:val="1155CC"/>
+            <w:u w:val="single"/>
+          </w:rPr>
+          <w:t xml:space="preserve">"Your user has no sales-agent record"</w:t>
+        </w:r>
+      </w:hyperlink>
+    </w:p>
+    <w:p>
+      <w:pPr>
+        <w:spacing w:after="40"/>
+        <w:ind w:left="403"/>
+      </w:pPr>
+      <w:hyperlink w:anchor="_Toc0059">
+        <w:r>
+          <w:rPr>
+            <w:color w:val="1155CC"/>
+            <w:u w:val="single"/>
+          </w:rPr>
+          <w:t xml:space="preserve">A scan or search finds nothing</w:t>
+        </w:r>
+      </w:hyperlink>
+    </w:p>
+    <w:p>
+      <w:pPr>
+        <w:spacing w:after="40"/>
+        <w:ind w:left="403"/>
+      </w:pPr>
+      <w:hyperlink w:anchor="_Toc0060">
+        <w:r>
+          <w:rPr>
+            <w:color w:val="1155CC"/>
+            <w:u w:val="single"/>
+          </w:rPr>
+          <w:t xml:space="preserve">The scanner is a "keyboard wedge" — keep the field focused</w:t>
+        </w:r>
+      </w:hyperlink>
+    </w:p>
+    <w:p>
+      <w:pPr>
+        <w:spacing w:after="40"/>
+        <w:ind w:left="403"/>
+      </w:pPr>
+      <w:hyperlink w:anchor="_Toc0061">
+        <w:r>
+          <w:rPr>
+            <w:color w:val="1155CC"/>
+            <w:u w:val="single"/>
+          </w:rPr>
+          <w:t xml:space="preserve">Slow network or a "blip" mid-sale — the unknown-outcome case</w:t>
+        </w:r>
+      </w:hyperlink>
+    </w:p>
+    <w:p>
+      <w:pPr>
+        <w:spacing w:after="40"/>
+        <w:ind w:left="403"/>
+      </w:pPr>
+      <w:hyperlink w:anchor="_Toc0062">
+        <w:r>
+          <w:rPr>
+            <w:color w:val="1155CC"/>
+            <w:u w:val="single"/>
+          </w:rPr>
+          <w:t xml:space="preserve">"Tendered is less than the total"</w:t>
+        </w:r>
+      </w:hyperlink>
+    </w:p>
+    <w:p>
+      <w:pPr>
+        <w:spacing w:after="40"/>
+        <w:ind w:left="403"/>
+      </w:pPr>
+      <w:hyperlink w:anchor="_Toc0063">
+        <w:r>
+          <w:rPr>
+            <w:color w:val="1155CC"/>
+            <w:u w:val="single"/>
+          </w:rPr>
+          <w:t xml:space="preserve">Reprinting a receipt (and why it never makes a new sale)</w:t>
+        </w:r>
+      </w:hyperlink>
+    </w:p>
+    <w:p>
+      <w:pPr>
+        <w:spacing w:after="40"/>
+        <w:ind w:left="403"/>
+      </w:pPr>
+      <w:hyperlink w:anchor="_Toc0064">
+        <w:r>
+          <w:rPr>
+            <w:color w:val="1155CC"/>
+            <w:u w:val="single"/>
+          </w:rPr>
+          <w:t xml:space="preserve">The printer, cash drawer, and scale in this build</w:t>
+        </w:r>
+      </w:hyperlink>
+    </w:p>
+    <w:p>
+      <w:pPr>
+        <w:spacing w:after="40"/>
+        <w:ind w:left="403"/>
+      </w:pPr>
+      <w:hyperlink w:anchor="_Toc0065">
+        <w:r>
+          <w:rPr>
+            <w:color w:val="1155CC"/>
+            <w:u w:val="single"/>
+          </w:rPr>
+          <w:t xml:space="preserve">Good habits that prevent problems</w:t>
+        </w:r>
+      </w:hyperlink>
+    </w:p>
+    <w:p>
+      <w:pPr>
+        <w:spacing w:after="40"/>
+        <w:ind w:left="403"/>
+      </w:pPr>
+      <w:hyperlink w:anchor="_Toc0066">
+        <w:r>
+          <w:rPr>
+            <w:color w:val="1155CC"/>
+            <w:u w:val="single"/>
+          </w:rPr>
+          <w:t xml:space="preserve">Quick reference — message to action</w:t>
+        </w:r>
+      </w:hyperlink>
+    </w:p>
+    <w:p>
+      <w:pPr>
+        <w:spacing w:after="40"/>
+        <w:ind w:left="0"/>
+      </w:pPr>
+      <w:hyperlink w:anchor="_Toc0067">
+        <w:r>
+          <w:rPr>
+            <w:b/>
+            <w:color w:val="1155CC"/>
+            <w:u w:val="single"/>
+          </w:rPr>
+          <w:t xml:space="preserve">For Supervisors and Store Managers</w:t>
+        </w:r>
+      </w:hyperlink>
+    </w:p>
+    <w:p>
+      <w:pPr>
+        <w:spacing w:after="40"/>
+        <w:ind w:left="403"/>
+      </w:pPr>
+      <w:hyperlink w:anchor="_Toc0068">
+        <w:r>
+          <w:rPr>
+            <w:color w:val="1155CC"/>
+            <w:u w:val="single"/>
+          </w:rPr>
+          <w:t xml:space="preserve">What each role can and cannot do</w:t>
+        </w:r>
+      </w:hyperlink>
+    </w:p>
+    <w:p>
+      <w:pPr>
+        <w:spacing w:after="40"/>
+        <w:ind w:left="403"/>
+      </w:pPr>
+      <w:hyperlink w:anchor="_Toc0069">
+        <w:r>
+          <w:rPr>
+            <w:color w:val="1155CC"/>
+            <w:u w:val="single"/>
+          </w:rPr>
+          <w:t xml:space="preserve">Segregation of duties — why two people, not one</w:t>
+        </w:r>
+      </w:hyperlink>
+    </w:p>
+    <w:p>
+      <w:pPr>
+        <w:spacing w:after="40"/>
+        <w:ind w:left="403"/>
+      </w:pPr>
+      <w:hyperlink w:anchor="_Toc0070">
+        <w:r>
+          <w:rPr>
+            <w:color w:val="1155CC"/>
+            <w:u w:val="single"/>
+          </w:rPr>
+          <w:t xml:space="preserve">Reconcile / Z-read — reading and posting the variance</w:t>
+        </w:r>
+      </w:hyperlink>
+    </w:p>
+    <w:p>
+      <w:pPr>
+        <w:spacing w:after="40"/>
+        <w:ind w:left="403"/>
+      </w:pPr>
+      <w:hyperlink w:anchor="_Toc0071">
+        <w:r>
+          <w:rPr>
+            <w:color w:val="1155CC"/>
+            <w:u w:val="single"/>
+          </w:rPr>
+          <w:t xml:space="preserve">X-read, payouts and reviewing a shift</w:t>
+        </w:r>
+      </w:hyperlink>
+    </w:p>
+    <w:p>
+      <w:pPr>
+        <w:spacing w:after="40"/>
+        <w:ind w:left="403"/>
+      </w:pPr>
+      <w:hyperlink w:anchor="_Toc0072">
+        <w:r>
+          <w:rPr>
+            <w:color w:val="1155CC"/>
+            <w:u w:val="single"/>
+          </w:rPr>
+          <w:t xml:space="preserve">Operating multiple tills and branches</w:t>
+        </w:r>
+      </w:hyperlink>
+    </w:p>
+    <w:p>
+      <w:pPr>
+        <w:spacing w:after="40"/>
+        <w:ind w:left="403"/>
+      </w:pPr>
+      <w:hyperlink w:anchor="_Toc0073">
+        <w:r>
+          <w:rPr>
+            <w:color w:val="1155CC"/>
+            <w:u w:val="single"/>
+          </w:rPr>
+          <w:t xml:space="preserve">Creating and retiring tills</w:t>
+        </w:r>
+      </w:hyperlink>
+    </w:p>
+    <w:p>
+      <w:pPr>
+        <w:spacing w:after="40"/>
+        <w:ind w:left="403"/>
+      </w:pPr>
+      <w:hyperlink w:anchor="_Toc0074">
+        <w:r>
+          <w:rPr>
+            <w:color w:val="1155CC"/>
+            <w:u w:val="single"/>
+          </w:rPr>
+          <w:t xml:space="preserve">Provisioning cashiers — who is allowed to sell</w:t>
+        </w:r>
+      </w:hyperlink>
+    </w:p>
+    <w:p>
+      <w:pPr>
+        <w:spacing w:after="40"/>
+        <w:ind w:left="403"/>
+      </w:pPr>
+      <w:hyperlink w:anchor="_Toc0075">
+        <w:r>
+          <w:rPr>
+            <w:color w:val="1155CC"/>
+            <w:u w:val="single"/>
+          </w:rPr>
+          <w:t xml:space="preserve">End-of-day close-out across tills</w:t>
+        </w:r>
+      </w:hyperlink>
+    </w:p>
+    <w:p>
+      <w:pPr>
+        <w:spacing w:after="40"/>
+        <w:ind w:left="403"/>
+      </w:pPr>
+      <w:hyperlink w:anchor="_Toc0076">
+        <w:r>
+          <w:rPr>
+            <w:color w:val="1155CC"/>
+            <w:u w:val="single"/>
+          </w:rPr>
+          <w:t xml:space="preserve">Quick reference</w:t>
+        </w:r>
+      </w:hyperlink>
     </w:p>
     <w:p>
       <w:r>
@@ -59,12 +1214,14 @@
       </w:r>
     </w:p>
     <w:p>
+      <w:bookmarkStart w:id="0" w:name="_Toc0000"/>
       <w:pPr>
         <w:pStyle w:val="Heading1"/>
       </w:pPr>
       <w:r>
         <w:t>Getting Started</w:t>
       </w:r>
+      <w:bookmarkEnd w:id="0"/>
     </w:p>
     <w:p>
       <w:r>
@@ -100,12 +1257,14 @@
       </w:r>
     </w:p>
     <w:p>
+      <w:bookmarkStart w:id="1" w:name="_Toc0001"/>
       <w:pPr>
         <w:pStyle w:val="Heading2"/>
       </w:pPr>
       <w:r>
         <w:t>What OrbixPOS Is</w:t>
       </w:r>
+      <w:bookmarkEnd w:id="1"/>
     </w:p>
     <w:p>
       <w:r>
@@ -345,12 +1504,14 @@
       </w:r>
     </w:p>
     <w:p>
+      <w:bookmarkStart w:id="2" w:name="_Toc0002"/>
       <w:pPr>
         <w:pStyle w:val="Heading2"/>
       </w:pPr>
       <w:r>
         <w:t>First-Run Setup — Pointing the Till at Your Server</w:t>
       </w:r>
+      <w:bookmarkEnd w:id="2"/>
     </w:p>
     <w:p>
       <w:r>
@@ -780,12 +1941,14 @@
       </w:r>
     </w:p>
     <w:p>
+      <w:bookmarkStart w:id="3" w:name="_Toc0003"/>
       <w:pPr>
         <w:pStyle w:val="Heading2"/>
       </w:pPr>
       <w:r>
         <w:t>Signing In</w:t>
       </w:r>
+      <w:bookmarkEnd w:id="3"/>
     </w:p>
     <w:p>
       <w:r>
@@ -1136,12 +2299,14 @@
       </w:r>
     </w:p>
     <w:p>
+      <w:bookmarkStart w:id="4" w:name="_Toc0004"/>
       <w:pPr>
         <w:pStyle w:val="Heading2"/>
       </w:pPr>
       <w:r>
         <w:t>The Screen Layout</w:t>
       </w:r>
+      <w:bookmarkEnd w:id="4"/>
     </w:p>
     <w:p>
       <w:r>
@@ -1455,12 +2620,14 @@
       </w:r>
     </w:p>
     <w:p>
+      <w:bookmarkStart w:id="5" w:name="_Toc0005"/>
       <w:pPr>
         <w:pStyle w:val="Heading2"/>
       </w:pPr>
       <w:r>
         <w:t>The Three Business Modes</w:t>
       </w:r>
+      <w:bookmarkEnd w:id="5"/>
     </w:p>
     <w:p>
       <w:r>
@@ -1755,12 +2922,14 @@
       </w:r>
     </w:p>
     <w:p>
+      <w:bookmarkStart w:id="6" w:name="_Toc0006"/>
       <w:pPr>
         <w:pStyle w:val="Heading2"/>
       </w:pPr>
       <w:r>
         <w:t>Signing Out</w:t>
       </w:r>
+      <w:bookmarkEnd w:id="6"/>
     </w:p>
     <w:p>
       <w:r>
@@ -1914,12 +3083,14 @@
       </w:r>
     </w:p>
     <w:p>
+      <w:bookmarkStart w:id="7" w:name="_Toc0007"/>
       <w:pPr>
         <w:pStyle w:val="Heading2"/>
       </w:pPr>
       <w:r>
         <w:t>Where to Go Next</w:t>
       </w:r>
+      <w:bookmarkEnd w:id="7"/>
     </w:p>
     <w:p>
       <w:r>
@@ -2011,12 +3182,14 @@
       </w:r>
     </w:p>
     <w:p>
+      <w:bookmarkStart w:id="8" w:name="_Toc0008"/>
       <w:pPr>
         <w:pStyle w:val="Heading1"/>
       </w:pPr>
       <w:r>
         <w:t>Starting and Ending a Shift</w:t>
       </w:r>
+      <w:bookmarkEnd w:id="8"/>
     </w:p>
     <w:p>
       <w:r>
@@ -2061,12 +3234,14 @@
       </w:r>
     </w:p>
     <w:p>
+      <w:bookmarkStart w:id="9" w:name="_Toc0009"/>
       <w:pPr>
         <w:pStyle w:val="Heading2"/>
       </w:pPr>
       <w:r>
         <w:t>What a till and a cash session are</w:t>
       </w:r>
+      <w:bookmarkEnd w:id="9"/>
     </w:p>
     <w:p>
       <w:r>
@@ -2289,12 +3464,14 @@
       </w:r>
     </w:p>
     <w:p>
+      <w:bookmarkStart w:id="10" w:name="_Toc0010"/>
       <w:pPr>
         <w:pStyle w:val="Heading2"/>
       </w:pPr>
       <w:r>
         <w:t>Opening your shift</w:t>
       </w:r>
+      <w:bookmarkEnd w:id="10"/>
     </w:p>
     <w:p>
       <w:r>
@@ -2871,12 +4048,14 @@
       </w:r>
     </w:p>
     <w:p>
+      <w:bookmarkStart w:id="11" w:name="_Toc0011"/>
       <w:pPr>
         <w:pStyle w:val="Heading2"/>
       </w:pPr>
       <w:r>
         <w:t>The session number and status chips</w:t>
       </w:r>
+      <w:bookmarkEnd w:id="11"/>
     </w:p>
     <w:p>
       <w:r>
@@ -3062,12 +4241,14 @@
       </w:r>
     </w:p>
     <w:p>
+      <w:bookmarkStart w:id="12" w:name="_Toc0012"/>
       <w:pPr>
         <w:pStyle w:val="Heading2"/>
       </w:pPr>
       <w:r>
         <w:t>The session menu</w:t>
       </w:r>
+      <w:bookmarkEnd w:id="12"/>
     </w:p>
     <w:p>
       <w:r>
@@ -3645,12 +4826,14 @@
       </w:r>
     </w:p>
     <w:p>
+      <w:bookmarkStart w:id="13" w:name="_Toc0013"/>
       <w:pPr>
         <w:pStyle w:val="Heading2"/>
       </w:pPr>
       <w:r>
         <w:t>X-read — a mid-shift drawer report</w:t>
       </w:r>
+      <w:bookmarkEnd w:id="13"/>
     </w:p>
     <w:p>
       <w:r>
@@ -3958,12 +5141,14 @@
       </w:r>
     </w:p>
     <w:p>
+      <w:bookmarkStart w:id="14" w:name="_Toc0014"/>
       <w:pPr>
         <w:pStyle w:val="Heading2"/>
       </w:pPr>
       <w:r>
         <w:t>Recording a cash payout</w:t>
       </w:r>
+      <w:bookmarkEnd w:id="14"/>
     </w:p>
     <w:p>
       <w:r>
@@ -4448,12 +5633,14 @@
       </w:r>
     </w:p>
     <w:p>
+      <w:bookmarkStart w:id="15" w:name="_Toc0015"/>
       <w:pPr>
         <w:pStyle w:val="Heading2"/>
       </w:pPr>
       <w:r>
         <w:t>Closing the session</w:t>
       </w:r>
+      <w:bookmarkEnd w:id="15"/>
     </w:p>
     <w:p>
       <w:r>
@@ -4995,12 +6182,14 @@
       </w:r>
     </w:p>
     <w:p>
+      <w:bookmarkStart w:id="16" w:name="_Toc0016"/>
       <w:pPr>
         <w:pStyle w:val="Heading2"/>
       </w:pPr>
       <w:r>
         <w:t>Reconcile / Z-read (supervisor only)</w:t>
       </w:r>
+      <w:bookmarkEnd w:id="16"/>
     </w:p>
     <w:p>
       <w:r>
@@ -5551,12 +6740,14 @@
       </w:r>
     </w:p>
     <w:p>
+      <w:bookmarkStart w:id="17" w:name="_Toc0017"/>
       <w:pPr>
         <w:pStyle w:val="Heading2"/>
       </w:pPr>
       <w:r>
         <w:t>End-of-shift checklist</w:t>
       </w:r>
+      <w:bookmarkEnd w:id="17"/>
     </w:p>
     <w:p>
       <w:r>
@@ -5780,12 +6971,14 @@
       </w:r>
     </w:p>
     <w:p>
+      <w:bookmarkStart w:id="18" w:name="_Toc0018"/>
       <w:pPr>
         <w:pStyle w:val="Heading1"/>
       </w:pPr>
       <w:r>
         <w:t>Selling — Supermarket</w:t>
       </w:r>
+      <w:bookmarkEnd w:id="18"/>
     </w:p>
     <w:p>
       <w:r>
@@ -5859,12 +7052,14 @@
       </w:r>
     </w:p>
     <w:p>
+      <w:bookmarkStart w:id="19" w:name="_Toc0019"/>
       <w:pPr>
         <w:pStyle w:val="Heading2"/>
       </w:pPr>
       <w:r>
         <w:t>1. The supermarket screen at a glance</w:t>
       </w:r>
+      <w:bookmarkEnd w:id="19"/>
     </w:p>
     <w:p>
       <w:r>
@@ -6299,12 +7494,14 @@
       </w:r>
     </w:p>
     <w:p>
+      <w:bookmarkStart w:id="20" w:name="_Toc0020"/>
       <w:pPr>
         <w:pStyle w:val="Heading2"/>
       </w:pPr>
       <w:r>
         <w:t>2. Adding items</w:t>
       </w:r>
+      <w:bookmarkEnd w:id="20"/>
     </w:p>
     <w:p>
       <w:r>
@@ -6753,12 +7950,14 @@
       </w:r>
     </w:p>
     <w:p>
+      <w:bookmarkStart w:id="21" w:name="_Toc0021"/>
       <w:pPr>
         <w:pStyle w:val="Heading2"/>
       </w:pPr>
       <w:r>
         <w:t>3. Working with lines in the grid</w:t>
       </w:r>
+      <w:bookmarkEnd w:id="21"/>
     </w:p>
     <w:p>
       <w:r>
@@ -7885,12 +9084,14 @@
       </w:r>
     </w:p>
     <w:p>
+      <w:bookmarkStart w:id="22" w:name="_Toc0022"/>
       <w:pPr>
         <w:pStyle w:val="Heading2"/>
       </w:pPr>
       <w:r>
         <w:t>4. Age-restricted items</w:t>
       </w:r>
+      <w:bookmarkEnd w:id="22"/>
     </w:p>
     <w:p>
       <w:r>
@@ -8070,12 +9271,14 @@
       </w:r>
     </w:p>
     <w:p>
+      <w:bookmarkStart w:id="23" w:name="_Toc0023"/>
       <w:pPr>
         <w:pStyle w:val="Heading2"/>
       </w:pPr>
       <w:r>
         <w:t>5. Choosing the customer</w:t>
       </w:r>
+      <w:bookmarkEnd w:id="23"/>
     </w:p>
     <w:p>
       <w:r>
@@ -8262,12 +9465,14 @@
       </w:r>
     </w:p>
     <w:p>
+      <w:bookmarkStart w:id="24" w:name="_Toc0024"/>
       <w:pPr>
         <w:pStyle w:val="Heading2"/>
       </w:pPr>
       <w:r>
         <w:t>6. Reading the running total</w:t>
       </w:r>
+      <w:bookmarkEnd w:id="24"/>
     </w:p>
     <w:p>
       <w:r>
@@ -8346,12 +9551,14 @@
       </w:r>
     </w:p>
     <w:p>
+      <w:bookmarkStart w:id="25" w:name="_Toc0025"/>
       <w:pPr>
         <w:pStyle w:val="Heading2"/>
       </w:pPr>
       <w:r>
         <w:t>7. Finishing the sale — Pay</w:t>
       </w:r>
+      <w:bookmarkEnd w:id="25"/>
     </w:p>
     <w:p>
       <w:r>
@@ -8448,12 +9655,14 @@
       </w:r>
     </w:p>
     <w:p>
+      <w:bookmarkStart w:id="26" w:name="_Toc0026"/>
       <w:pPr>
         <w:pStyle w:val="Heading2"/>
       </w:pPr>
       <w:r>
         <w:t>8. Quick troubleshooting</w:t>
       </w:r>
+      <w:bookmarkEnd w:id="26"/>
     </w:p>
     <w:tbl>
       <w:tblPr>
@@ -8825,12 +10034,14 @@
       </w:r>
     </w:p>
     <w:p>
+      <w:bookmarkStart w:id="27" w:name="_Toc0027"/>
       <w:pPr>
         <w:pStyle w:val="Heading1"/>
       </w:pPr>
       <w:r>
         <w:t>Selling — Pharmacy and Restaurant</w:t>
       </w:r>
+      <w:bookmarkEnd w:id="27"/>
     </w:p>
     <w:p>
       <w:r>
@@ -8913,12 +10124,14 @@
       </w:r>
     </w:p>
     <w:p>
+      <w:bookmarkStart w:id="28" w:name="_Toc0028"/>
       <w:pPr>
         <w:pStyle w:val="Heading2"/>
       </w:pPr>
       <w:r>
         <w:t>1. Switching modes</w:t>
       </w:r>
+      <w:bookmarkEnd w:id="28"/>
     </w:p>
     <w:p>
       <w:r>
@@ -9175,12 +10388,14 @@
       </w:r>
     </w:p>
     <w:p>
+      <w:bookmarkStart w:id="29" w:name="_Toc0029"/>
       <w:pPr>
         <w:pStyle w:val="Heading2"/>
       </w:pPr>
       <w:r>
         <w:t>2. The Pharmacy register</w:t>
       </w:r>
+      <w:bookmarkEnd w:id="29"/>
     </w:p>
     <w:p>
       <w:r>
@@ -10160,12 +11375,14 @@
       </w:r>
     </w:p>
     <w:p>
+      <w:bookmarkStart w:id="30" w:name="_Toc0030"/>
       <w:pPr>
         <w:pStyle w:val="Heading2"/>
       </w:pPr>
       <w:r>
         <w:t>3. The Restaurant register</w:t>
       </w:r>
+      <w:bookmarkEnd w:id="30"/>
     </w:p>
     <w:p>
       <w:r>
@@ -10992,12 +12209,14 @@
       </w:r>
     </w:p>
     <w:p>
+      <w:bookmarkStart w:id="31" w:name="_Toc0031"/>
       <w:pPr>
         <w:pStyle w:val="Heading2"/>
       </w:pPr>
       <w:r>
         <w:t>4. Quick reference</w:t>
       </w:r>
+      <w:bookmarkEnd w:id="31"/>
     </w:p>
     <w:tbl>
       <w:tblPr>
@@ -11463,12 +12682,14 @@
       </w:r>
     </w:p>
     <w:p>
+      <w:bookmarkStart w:id="32" w:name="_Toc0032"/>
       <w:pPr>
         <w:pStyle w:val="Heading1"/>
       </w:pPr>
       <w:r>
         <w:t>Taking Payment</w:t>
       </w:r>
+      <w:bookmarkEnd w:id="32"/>
     </w:p>
     <w:p>
       <w:r>
@@ -11527,12 +12748,14 @@
       </w:r>
     </w:p>
     <w:p>
+      <w:bookmarkStart w:id="33" w:name="_Toc0033"/>
       <w:pPr>
         <w:pStyle w:val="Heading2"/>
       </w:pPr>
       <w:r>
         <w:t>Opening the Payment screen</w:t>
       </w:r>
+      <w:bookmarkEnd w:id="33"/>
     </w:p>
     <w:p>
       <w:r>
@@ -11690,12 +12913,14 @@
       </w:r>
     </w:p>
     <w:p>
+      <w:bookmarkStart w:id="34" w:name="_Toc0034"/>
       <w:pPr>
         <w:pStyle w:val="Heading2"/>
       </w:pPr>
       <w:r>
         <w:t>What you see on the Payment screen</w:t>
       </w:r>
+      <w:bookmarkEnd w:id="34"/>
     </w:p>
     <w:p>
       <w:r>
@@ -12201,12 +13426,14 @@
       </w:r>
     </w:p>
     <w:p>
+      <w:bookmarkStart w:id="35" w:name="_Toc0035"/>
       <w:pPr>
         <w:pStyle w:val="Heading2"/>
       </w:pPr>
       <w:r>
         <w:t>The four tender types</w:t>
       </w:r>
+      <w:bookmarkEnd w:id="35"/>
     </w:p>
     <w:p>
       <w:r>
@@ -12489,12 +13716,14 @@
       </w:r>
     </w:p>
     <w:p>
+      <w:bookmarkStart w:id="36" w:name="_Toc0036"/>
       <w:pPr>
         <w:pStyle w:val="Heading2"/>
       </w:pPr>
       <w:r>
         <w:t>Task: a simple cash sale</w:t>
       </w:r>
+      <w:bookmarkEnd w:id="36"/>
     </w:p>
     <w:p>
       <w:r>
@@ -12703,12 +13932,14 @@
       </w:r>
     </w:p>
     <w:p>
+      <w:bookmarkStart w:id="37" w:name="_Toc0037"/>
       <w:pPr>
         <w:pStyle w:val="Heading2"/>
       </w:pPr>
       <w:r>
         <w:t>Task: split or multi-tender payment</w:t>
       </w:r>
+      <w:bookmarkEnd w:id="37"/>
     </w:p>
     <w:p>
       <w:r>
@@ -13234,12 +14465,14 @@
       </w:r>
     </w:p>
     <w:p>
+      <w:bookmarkStart w:id="38" w:name="_Toc0038"/>
       <w:pPr>
         <w:pStyle w:val="Heading2"/>
       </w:pPr>
       <w:r>
         <w:t>The change preview</w:t>
       </w:r>
+      <w:bookmarkEnd w:id="38"/>
     </w:p>
     <w:p>
       <w:r>
@@ -13355,12 +14588,14 @@
       </w:r>
     </w:p>
     <w:p>
+      <w:bookmarkStart w:id="39" w:name="_Toc0039"/>
       <w:pPr>
         <w:pStyle w:val="Heading2"/>
       </w:pPr>
       <w:r>
         <w:t>Completing the sale</w:t>
       </w:r>
+      <w:bookmarkEnd w:id="39"/>
     </w:p>
     <w:p>
       <w:r>
@@ -13625,12 +14860,14 @@
       </w:r>
     </w:p>
     <w:p>
+      <w:bookmarkStart w:id="40" w:name="_Toc0040"/>
       <w:pPr>
         <w:pStyle w:val="Heading2"/>
       </w:pPr>
       <w:r>
         <w:t>"Did that go through?" — the safe-retry guarantee</w:t>
       </w:r>
+      <w:bookmarkEnd w:id="40"/>
     </w:p>
     <w:p>
       <w:r>
@@ -14029,12 +15266,14 @@
       </w:r>
     </w:p>
     <w:p>
+      <w:bookmarkStart w:id="41" w:name="_Toc0041"/>
       <w:pPr>
         <w:pStyle w:val="Heading2"/>
       </w:pPr>
       <w:r>
         <w:t>After payment: the receipt</w:t>
       </w:r>
+      <w:bookmarkEnd w:id="41"/>
     </w:p>
     <w:p>
       <w:r>
@@ -14108,12 +15347,14 @@
       </w:r>
     </w:p>
     <w:p>
+      <w:bookmarkStart w:id="42" w:name="_Toc0042"/>
       <w:pPr>
         <w:pStyle w:val="Heading2"/>
       </w:pPr>
       <w:r>
         <w:t>Quick reference</w:t>
       </w:r>
+      <w:bookmarkEnd w:id="42"/>
     </w:p>
     <w:tbl>
       <w:tblPr>
@@ -14544,12 +15785,14 @@
       </w:r>
     </w:p>
     <w:p>
+      <w:bookmarkStart w:id="43" w:name="_Toc0043"/>
       <w:pPr>
         <w:pStyle w:val="Heading1"/>
       </w:pPr>
       <w:r>
         <w:t>Receipts and Refunds</w:t>
       </w:r>
+      <w:bookmarkEnd w:id="43"/>
     </w:p>
     <w:p>
       <w:r>
@@ -14585,12 +15828,14 @@
       </w:r>
     </w:p>
     <w:p>
+      <w:bookmarkStart w:id="44" w:name="_Toc0044"/>
       <w:pPr>
         <w:pStyle w:val="Heading2"/>
       </w:pPr>
       <w:r>
         <w:t>1. The receipt screen</w:t>
       </w:r>
+      <w:bookmarkEnd w:id="44"/>
     </w:p>
     <w:p>
       <w:r>
@@ -15211,12 +16456,14 @@
       </w:r>
     </w:p>
     <w:p>
+      <w:bookmarkStart w:id="45" w:name="_Toc0045"/>
       <w:pPr>
         <w:pStyle w:val="Heading2"/>
       </w:pPr>
       <w:r>
         <w:t>2. Printing a receipt</w:t>
       </w:r>
+      <w:bookmarkEnd w:id="45"/>
     </w:p>
     <w:p>
       <w:r>
@@ -15348,12 +16595,14 @@
       </w:r>
     </w:p>
     <w:p>
+      <w:bookmarkStart w:id="46" w:name="_Toc0046"/>
       <w:pPr>
         <w:pStyle w:val="Heading2"/>
       </w:pPr>
       <w:r>
         <w:t>3. Gift receipts (hiding prices)</w:t>
       </w:r>
+      <w:bookmarkEnd w:id="46"/>
     </w:p>
     <w:p>
       <w:r>
@@ -15520,12 +16769,14 @@
       </w:r>
     </w:p>
     <w:p>
+      <w:bookmarkStart w:id="47" w:name="_Toc0047"/>
       <w:pPr>
         <w:pStyle w:val="Heading2"/>
       </w:pPr>
       <w:r>
         <w:t>4. Reprinting an earlier receipt</w:t>
       </w:r>
+      <w:bookmarkEnd w:id="47"/>
     </w:p>
     <w:p>
       <w:r>
@@ -16100,12 +17351,14 @@
       </w:r>
     </w:p>
     <w:p>
+      <w:bookmarkStart w:id="48" w:name="_Toc0048"/>
       <w:pPr>
         <w:pStyle w:val="Heading2"/>
       </w:pPr>
       <w:r>
         <w:t>5. Refunding (reversing) a whole sale</w:t>
       </w:r>
+      <w:bookmarkEnd w:id="48"/>
     </w:p>
     <w:p>
       <w:r>
@@ -16562,12 +17815,14 @@
       </w:r>
     </w:p>
     <w:p>
+      <w:bookmarkStart w:id="49" w:name="_Toc0049"/>
       <w:pPr>
         <w:pStyle w:val="Heading2"/>
       </w:pPr>
       <w:r>
         <w:t>6. What OrbixPOS does *not* do — partial and single-line refunds</w:t>
       </w:r>
+      <w:bookmarkEnd w:id="49"/>
     </w:p>
     <w:p>
       <w:r>
@@ -16770,12 +18025,14 @@
       </w:r>
     </w:p>
     <w:p>
+      <w:bookmarkStart w:id="50" w:name="_Toc0050"/>
       <w:pPr>
         <w:pStyle w:val="Heading2"/>
       </w:pPr>
       <w:r>
         <w:t>7. The cash-drawer refund payout (the alternative)</w:t>
       </w:r>
+      <w:bookmarkEnd w:id="50"/>
     </w:p>
     <w:p>
       <w:r>
@@ -17056,12 +18313,14 @@
       </w:r>
     </w:p>
     <w:p>
+      <w:bookmarkStart w:id="51" w:name="_Toc0051"/>
       <w:pPr>
         <w:pStyle w:val="Heading2"/>
       </w:pPr>
       <w:r>
         <w:t>8. Quick reference and troubleshooting</w:t>
       </w:r>
+      <w:bookmarkEnd w:id="51"/>
     </w:p>
     <w:tbl>
       <w:tblPr>
@@ -17594,12 +18853,14 @@
       </w:r>
     </w:p>
     <w:p>
+      <w:bookmarkStart w:id="52" w:name="_Toc0052"/>
       <w:pPr>
         <w:pStyle w:val="Heading1"/>
       </w:pPr>
       <w:r>
         <w:t>Troubleshooting and Good Practice</w:t>
       </w:r>
+      <w:bookmarkEnd w:id="52"/>
     </w:p>
     <w:p>
       <w:r>
@@ -17655,12 +18916,14 @@
       </w:r>
     </w:p>
     <w:p>
+      <w:bookmarkStart w:id="53" w:name="_Toc0053"/>
       <w:pPr>
         <w:pStyle w:val="Heading2"/>
       </w:pPr>
       <w:r>
         <w:t>How OrbixPOS tells you something went wrong</w:t>
       </w:r>
+      <w:bookmarkEnd w:id="53"/>
     </w:p>
     <w:p>
       <w:r>
@@ -17753,12 +19016,14 @@
       </w:r>
     </w:p>
     <w:p>
+      <w:bookmarkStart w:id="54" w:name="_Toc0054"/>
       <w:pPr>
         <w:pStyle w:val="Heading2"/>
       </w:pPr>
       <w:r>
         <w:t>Cannot reach the server</w:t>
       </w:r>
+      <w:bookmarkEnd w:id="54"/>
     </w:p>
     <w:p>
       <w:r>
@@ -18425,12 +19690,14 @@
       </w:r>
     </w:p>
     <w:p>
+      <w:bookmarkStart w:id="55" w:name="_Toc0055"/>
       <w:pPr>
         <w:pStyle w:val="Heading2"/>
       </w:pPr>
       <w:r>
         <w:t>Your session has expired / you were signed out</w:t>
       </w:r>
+      <w:bookmarkEnd w:id="55"/>
     </w:p>
     <w:p>
       <w:r>
@@ -18580,12 +19847,14 @@
       </w:r>
     </w:p>
     <w:p>
+      <w:bookmarkStart w:id="56" w:name="_Toc0056"/>
       <w:pPr>
         <w:pStyle w:val="Heading2"/>
       </w:pPr>
       <w:r>
         <w:t>You do not have permission</w:t>
       </w:r>
+      <w:bookmarkEnd w:id="56"/>
     </w:p>
     <w:p>
       <w:r>
@@ -18889,12 +20158,14 @@
       </w:r>
     </w:p>
     <w:p>
+      <w:bookmarkStart w:id="57" w:name="_Toc0057"/>
       <w:pPr>
         <w:pStyle w:val="Heading2"/>
       </w:pPr>
       <w:r>
         <w:t>Age not verified stops a sale</w:t>
       </w:r>
+      <w:bookmarkEnd w:id="57"/>
     </w:p>
     <w:p>
       <w:r>
@@ -19097,12 +20368,14 @@
       </w:r>
     </w:p>
     <w:p>
+      <w:bookmarkStart w:id="58" w:name="_Toc0058"/>
       <w:pPr>
         <w:pStyle w:val="Heading2"/>
       </w:pPr>
       <w:r>
         <w:t>"Your user has no sales-agent record"</w:t>
       </w:r>
+      <w:bookmarkEnd w:id="58"/>
     </w:p>
     <w:p>
       <w:r>
@@ -19236,12 +20509,14 @@
       </w:r>
     </w:p>
     <w:p>
+      <w:bookmarkStart w:id="59" w:name="_Toc0059"/>
       <w:pPr>
         <w:pStyle w:val="Heading2"/>
       </w:pPr>
       <w:r>
         <w:t>A scan or search finds nothing</w:t>
       </w:r>
+      <w:bookmarkEnd w:id="59"/>
     </w:p>
     <w:p>
       <w:r>
@@ -19472,12 +20747,14 @@
       </w:r>
     </w:p>
     <w:p>
+      <w:bookmarkStart w:id="60" w:name="_Toc0060"/>
       <w:pPr>
         <w:pStyle w:val="Heading2"/>
       </w:pPr>
       <w:r>
         <w:t>The scanner is a "keyboard wedge" — keep the field focused</w:t>
       </w:r>
+      <w:bookmarkEnd w:id="60"/>
     </w:p>
     <w:p>
       <w:r>
@@ -19683,12 +20960,14 @@
       </w:r>
     </w:p>
     <w:p>
+      <w:bookmarkStart w:id="61" w:name="_Toc0061"/>
       <w:pPr>
         <w:pStyle w:val="Heading2"/>
       </w:pPr>
       <w:r>
         <w:t>Slow network or a "blip" mid-sale — the unknown-outcome case</w:t>
       </w:r>
+      <w:bookmarkEnd w:id="61"/>
     </w:p>
     <w:p>
       <w:r>
@@ -19984,12 +21263,14 @@
       </w:r>
     </w:p>
     <w:p>
+      <w:bookmarkStart w:id="62" w:name="_Toc0062"/>
       <w:pPr>
         <w:pStyle w:val="Heading2"/>
       </w:pPr>
       <w:r>
         <w:t>"Tendered is less than the total"</w:t>
       </w:r>
+      <w:bookmarkEnd w:id="62"/>
     </w:p>
     <w:p>
       <w:r>
@@ -20209,12 +21490,14 @@
       </w:r>
     </w:p>
     <w:p>
+      <w:bookmarkStart w:id="63" w:name="_Toc0063"/>
       <w:pPr>
         <w:pStyle w:val="Heading2"/>
       </w:pPr>
       <w:r>
         <w:t>Reprinting a receipt (and why it never makes a new sale)</w:t>
       </w:r>
+      <w:bookmarkEnd w:id="63"/>
     </w:p>
     <w:p>
       <w:r>
@@ -20418,12 +21701,14 @@
       </w:r>
     </w:p>
     <w:p>
+      <w:bookmarkStart w:id="64" w:name="_Toc0064"/>
       <w:pPr>
         <w:pStyle w:val="Heading2"/>
       </w:pPr>
       <w:r>
         <w:t>The printer, cash drawer, and scale in this build</w:t>
       </w:r>
+      <w:bookmarkEnd w:id="64"/>
     </w:p>
     <w:p>
       <w:r>
@@ -20685,12 +21970,14 @@
       </w:r>
     </w:p>
     <w:p>
+      <w:bookmarkStart w:id="65" w:name="_Toc0065"/>
       <w:pPr>
         <w:pStyle w:val="Heading2"/>
       </w:pPr>
       <w:r>
         <w:t>Good habits that prevent problems</w:t>
       </w:r>
+      <w:bookmarkEnd w:id="65"/>
     </w:p>
     <w:p>
       <w:r>
@@ -20858,12 +22145,14 @@
       </w:r>
     </w:p>
     <w:p>
+      <w:bookmarkStart w:id="66" w:name="_Toc0066"/>
       <w:pPr>
         <w:pStyle w:val="Heading2"/>
       </w:pPr>
       <w:r>
         <w:t>Quick reference — message to action</w:t>
       </w:r>
+      <w:bookmarkEnd w:id="66"/>
     </w:p>
     <w:tbl>
       <w:tblPr>
@@ -21444,12 +22733,14 @@
       </w:r>
     </w:p>
     <w:p>
+      <w:bookmarkStart w:id="67" w:name="_Toc0067"/>
       <w:pPr>
         <w:pStyle w:val="Heading1"/>
       </w:pPr>
       <w:r>
         <w:t>For Supervisors and Store Managers</w:t>
       </w:r>
+      <w:bookmarkEnd w:id="67"/>
     </w:p>
     <w:p>
       <w:r>
@@ -21508,12 +22799,14 @@
       </w:r>
     </w:p>
     <w:p>
+      <w:bookmarkStart w:id="68" w:name="_Toc0068"/>
       <w:pPr>
         <w:pStyle w:val="Heading2"/>
       </w:pPr>
       <w:r>
         <w:t>What each role can and cannot do</w:t>
       </w:r>
+      <w:bookmarkEnd w:id="68"/>
     </w:p>
     <w:p>
       <w:r>
@@ -22114,12 +23407,14 @@
       </w:r>
     </w:p>
     <w:p>
+      <w:bookmarkStart w:id="69" w:name="_Toc0069"/>
       <w:pPr>
         <w:pStyle w:val="Heading2"/>
       </w:pPr>
       <w:r>
         <w:t>Segregation of duties — why two people, not one</w:t>
       </w:r>
+      <w:bookmarkEnd w:id="69"/>
     </w:p>
     <w:p>
       <w:r>
@@ -22284,12 +23579,14 @@
       </w:r>
     </w:p>
     <w:p>
+      <w:bookmarkStart w:id="70" w:name="_Toc0070"/>
       <w:pPr>
         <w:pStyle w:val="Heading2"/>
       </w:pPr>
       <w:r>
         <w:t>Reconcile / Z-read — reading and posting the variance</w:t>
       </w:r>
+      <w:bookmarkEnd w:id="70"/>
     </w:p>
     <w:p>
       <w:r>
@@ -23095,12 +24392,14 @@
       </w:r>
     </w:p>
     <w:p>
+      <w:bookmarkStart w:id="71" w:name="_Toc0071"/>
       <w:pPr>
         <w:pStyle w:val="Heading2"/>
       </w:pPr>
       <w:r>
         <w:t>X-read, payouts and reviewing a shift</w:t>
       </w:r>
+      <w:bookmarkEnd w:id="71"/>
     </w:p>
     <w:p>
       <w:r>
@@ -23539,12 +24838,14 @@
       </w:r>
     </w:p>
     <w:p>
+      <w:bookmarkStart w:id="72" w:name="_Toc0072"/>
       <w:pPr>
         <w:pStyle w:val="Heading2"/>
       </w:pPr>
       <w:r>
         <w:t>Operating multiple tills and branches</w:t>
       </w:r>
+      <w:bookmarkEnd w:id="72"/>
     </w:p>
     <w:p>
       <w:r>
@@ -23680,12 +24981,14 @@
       </w:r>
     </w:p>
     <w:p>
+      <w:bookmarkStart w:id="73" w:name="_Toc0073"/>
       <w:pPr>
         <w:pStyle w:val="Heading2"/>
       </w:pPr>
       <w:r>
         <w:t>Creating and retiring tills</w:t>
       </w:r>
+      <w:bookmarkEnd w:id="73"/>
     </w:p>
     <w:p>
       <w:r>
@@ -23986,12 +25289,14 @@
       </w:r>
     </w:p>
     <w:p>
+      <w:bookmarkStart w:id="74" w:name="_Toc0074"/>
       <w:pPr>
         <w:pStyle w:val="Heading2"/>
       </w:pPr>
       <w:r>
         <w:t>Provisioning cashiers — who is allowed to sell</w:t>
       </w:r>
+      <w:bookmarkEnd w:id="74"/>
     </w:p>
     <w:p>
       <w:r>
@@ -24356,12 +25661,14 @@
       </w:r>
     </w:p>
     <w:p>
+      <w:bookmarkStart w:id="75" w:name="_Toc0075"/>
       <w:pPr>
         <w:pStyle w:val="Heading2"/>
       </w:pPr>
       <w:r>
         <w:t>End-of-day close-out across tills</w:t>
       </w:r>
+      <w:bookmarkEnd w:id="75"/>
     </w:p>
     <w:p>
       <w:r>
@@ -24885,12 +26192,14 @@
       </w:r>
     </w:p>
     <w:p>
+      <w:bookmarkStart w:id="76" w:name="_Toc0076"/>
       <w:pPr>
         <w:pStyle w:val="Heading2"/>
       </w:pPr>
       <w:r>
         <w:t>Quick reference</w:t>
       </w:r>
+      <w:bookmarkEnd w:id="76"/>
     </w:p>
     <w:tbl>
       <w:tblPr>

</xml_diff>